<commit_message>
update comparing batch and stream
</commit_message>
<xml_diff>
--- a/baocao.docx
+++ b/baocao.docx
@@ -500,25 +500,7 @@
                 <w:sz w:val="27"/>
                 <w:szCs w:val="27"/>
               </w:rPr>
-              <w:t xml:space="preserve">Vũ </w:t>
-            </w:r>
-            <w:proofErr w:type="gramStart"/>
-            <w:r>
-              <w:rPr>
-                <w:rFonts w:eastAsia="Times New Roman" w:cs="Times New Roman"/>
-                <w:sz w:val="27"/>
-                <w:szCs w:val="27"/>
-              </w:rPr>
-              <w:t>An</w:t>
-            </w:r>
-            <w:proofErr w:type="gramEnd"/>
-            <w:r>
-              <w:rPr>
-                <w:rFonts w:eastAsia="Times New Roman" w:cs="Times New Roman"/>
-                <w:sz w:val="27"/>
-                <w:szCs w:val="27"/>
-              </w:rPr>
-              <w:t xml:space="preserve"> Bình</w:t>
+              <w:t>Vũ An Bình</w:t>
             </w:r>
           </w:p>
         </w:tc>
@@ -1381,11 +1363,48 @@
         <w:pStyle w:val="ListParagraph"/>
       </w:pPr>
       <w:r>
-        <w:t xml:space="preserve">Khi dữ liệu đã đến các công cụ lưu trữ thì sẽ trở thành dữ liệu lịch sử, dữ liệu này thường được xử lý trong các nhiệm vụ theo lô (các nhiệm vụ được khởi động theo định kì – batch processing).  </w:t>
-      </w:r>
-    </w:p>
-    <w:p>
-      <w:r>
+        <w:t>Khi dữ liệu đã đến các công cụ lưu trữ thì sẽ trở thành dữ liệu lịch sử, dữ liệu này thường được xử lý trong các nhiệm vụ theo lô (các nhiệm vụ được khởi động theo định kì – batch processing).</w:t>
+      </w:r>
+      <w:r>
+        <w:t xml:space="preserve"> Các hệ thống phân tán MapReduce và Spark đã được nghiên cứu và phát triển để xử lý dữ liệu theo lô hiệu quả.</w:t>
+      </w:r>
+      <w:r>
+        <w:t xml:space="preserve"> Xử lý theo lô ít xảy ra thường xuyên hơn so với xử lý theo luồng, do đó trong ML, xử lý theo lô thường được sử dụng để tính toán các đặc trưng thay đổi ít thường xuyên. Các đặc trung được trích xuất thông qua xử lý theo lô (đặc trưng theo lô) còn được gọi là đặc trưng tĩnh.</w:t>
+      </w:r>
+    </w:p>
+    <w:p>
+      <w:pPr>
+        <w:pStyle w:val="ListParagraph"/>
+      </w:pPr>
+      <w:r>
+        <w:t>Xử lý dữ liệu theo luồng (stream) dùng để chỉ việc thực hiện tín toán trên dữ liệu truyền trực tuyến. Việc tính toán cũng có thể được kích hoạt định kì nhưng khoảng thời gian thường ngắn hơn so với các nhiệm vụ xử lý theo lô.</w:t>
+      </w:r>
+      <w:r>
+        <w:t xml:space="preserve"> Việc xử lý theo luồng mang lại độ trễ thấp do xử lý dữ liệu ngay khi được tạo ra mà không cần phải ghi vào cơ sở dữ liệu trước. Và xử lý luồng cho phép tính toán trên dữ liệu mới mỗi ngày và kết hợp dữ liệu tính toán mới với dữ liệu tính toán cũ hơn, ngăn chặn trùng lặp. Xử lý theo luồng được sử dụng để tính toán các đặc trưng thay đổi nhanh. Các đặc trưng truyền trực tuyến được trích xuất thông qua xử lý theo luồng còn được gọi là đặc trưng động. Việc xử lý luồng khó hơn theo lô vì lượng dữ liệu không bị giới hạn và dữ liệu đến với tốc độ khác nhau cũng như tốc độ biến đổi khác nhau.</w:t>
+      </w:r>
+    </w:p>
+    <w:p>
+      <w:pPr>
+        <w:pStyle w:val="ListParagraph"/>
+      </w:pPr>
+      <w:r>
+        <w:t>Có nhiều vấn đề cần kết hợp cả 2 đặc trưng, và cơ sở hạ tầng cho phép xử lý theo luồng cũng như theo lô và kết hợp chúng lại để đưa vào mô hình ML.</w:t>
+      </w:r>
+    </w:p>
+    <w:p/>
+    <w:p>
+      <w:pPr>
+        <w:pStyle w:val="ListParagraph"/>
+      </w:pPr>
+    </w:p>
+    <w:p>
+      <w:pPr>
+        <w:pStyle w:val="ListParagraph"/>
+      </w:pPr>
+    </w:p>
+    <w:p>
+      <w:r>
+        <w:lastRenderedPageBreak/>
         <w:br w:type="page"/>
       </w:r>
     </w:p>
@@ -1405,6 +1424,30 @@
       <w:r>
         <w:t>Mô hình và phương pháp thực hiện</w:t>
       </w:r>
+    </w:p>
+    <w:p>
+      <w:pPr>
+        <w:ind w:left="360"/>
+      </w:pPr>
+      <w:r>
+        <w:t>Nguồn dữ liệu từ API đưa vào socket, sau đó đưa vào Kafka producer</w:t>
+      </w:r>
+    </w:p>
+    <w:p>
+      <w:pPr>
+        <w:ind w:left="360"/>
+      </w:pPr>
+      <w:r>
+        <w:t xml:space="preserve">Dữ liệu khi được tạo ra ở socket thì </w:t>
+      </w:r>
+      <w:r>
+        <w:t>Kafka Producer sẽ nhận và đưa vào Spark xử lý.</w:t>
+      </w:r>
+    </w:p>
+    <w:p>
+      <w:pPr>
+        <w:ind w:left="360"/>
+      </w:pPr>
     </w:p>
     <w:p>
       <w:r>

</xml_diff>